<commit_message>
Part list updated. word doc also updated with new ICs and comparison of XMC and AMIC.
</commit_message>
<xml_diff>
--- a/Documents/Dev-Files/EtherCAT Based Servo Control System - Research.docx
+++ b/Documents/Dev-Files/EtherCAT Based Servo Control System - Research.docx
@@ -15,74 +15,14 @@
         <w:rPr>
           <w:rFonts w:ascii="Times New Roman" w:hAnsi="Times New Roman" w:cs="Times New Roman"/>
         </w:rPr>
-        <w:t>E</w:t>
-      </w:r>
+        <w:t>EtherCAT</w:t>
+      </w:r>
+      <w:proofErr w:type="spellEnd"/>
       <w:r>
         <w:rPr>
           <w:rFonts w:ascii="Times New Roman" w:hAnsi="Times New Roman" w:cs="Times New Roman"/>
         </w:rPr>
-        <w:t>ther</w:t>
-      </w:r>
-      <w:r>
-        <w:rPr>
-          <w:rFonts w:ascii="Times New Roman" w:hAnsi="Times New Roman" w:cs="Times New Roman"/>
-        </w:rPr>
-        <w:t>CAT</w:t>
-      </w:r>
-      <w:proofErr w:type="spellEnd"/>
-      <w:r>
-        <w:rPr>
-          <w:rFonts w:ascii="Times New Roman" w:hAnsi="Times New Roman" w:cs="Times New Roman"/>
-        </w:rPr>
-        <w:t xml:space="preserve"> </w:t>
-      </w:r>
-      <w:r>
-        <w:rPr>
-          <w:rFonts w:ascii="Times New Roman" w:hAnsi="Times New Roman" w:cs="Times New Roman"/>
-        </w:rPr>
-        <w:t>B</w:t>
-      </w:r>
-      <w:r>
-        <w:rPr>
-          <w:rFonts w:ascii="Times New Roman" w:hAnsi="Times New Roman" w:cs="Times New Roman"/>
-        </w:rPr>
-        <w:t xml:space="preserve">ased </w:t>
-      </w:r>
-      <w:r>
-        <w:rPr>
-          <w:rFonts w:ascii="Times New Roman" w:hAnsi="Times New Roman" w:cs="Times New Roman"/>
-        </w:rPr>
-        <w:t>S</w:t>
-      </w:r>
-      <w:r>
-        <w:rPr>
-          <w:rFonts w:ascii="Times New Roman" w:hAnsi="Times New Roman" w:cs="Times New Roman"/>
-        </w:rPr>
-        <w:t>erv</w:t>
-      </w:r>
-      <w:r>
-        <w:rPr>
-          <w:rFonts w:ascii="Times New Roman" w:hAnsi="Times New Roman" w:cs="Times New Roman"/>
-        </w:rPr>
-        <w:t>o C</w:t>
-      </w:r>
-      <w:r>
-        <w:rPr>
-          <w:rFonts w:ascii="Times New Roman" w:hAnsi="Times New Roman" w:cs="Times New Roman"/>
-        </w:rPr>
-        <w:t xml:space="preserve">ontrol </w:t>
-      </w:r>
-      <w:r>
-        <w:rPr>
-          <w:rFonts w:ascii="Times New Roman" w:hAnsi="Times New Roman" w:cs="Times New Roman"/>
-        </w:rPr>
-        <w:t>S</w:t>
-      </w:r>
-      <w:r>
-        <w:rPr>
-          <w:rFonts w:ascii="Times New Roman" w:hAnsi="Times New Roman" w:cs="Times New Roman"/>
-        </w:rPr>
-        <w:t>ystem</w:t>
+        <w:t xml:space="preserve"> Based Servo Control System</w:t>
       </w:r>
     </w:p>
     <w:p/>
@@ -139,64 +79,116 @@
       </w:r>
       <w:proofErr w:type="spellEnd"/>
       <w:r>
+        <w:t xml:space="preserve"> is fully compliant </w:t>
+      </w:r>
+      <w:r>
+        <w:t>with Ethernet</w:t>
+      </w:r>
+      <w:r>
+        <w:t xml:space="preserve"> standards, with 100Mbps transfer speed </w:t>
+      </w:r>
+      <w:r>
+        <w:t>and good</w:t>
+      </w:r>
+      <w:r>
+        <w:t xml:space="preserve"> synchronization.  </w:t>
+      </w:r>
+      <w:r>
+        <w:t>It is</w:t>
+      </w:r>
+      <w:r>
         <w:t xml:space="preserve"> </w:t>
       </w:r>
       <w:r>
-        <w:t>is fully</w:t>
-      </w:r>
-      <w:r>
-        <w:t xml:space="preserve"> compliant </w:t>
-      </w:r>
-      <w:r>
-        <w:t>with Ethernet</w:t>
-      </w:r>
-      <w:r>
-        <w:t xml:space="preserve"> standards, with 100Mbps transfer speed </w:t>
-      </w:r>
-      <w:r>
-        <w:t>and good</w:t>
-      </w:r>
-      <w:r>
-        <w:t xml:space="preserve"> synchronization.  </w:t>
-      </w:r>
-      <w:r>
-        <w:t>It is</w:t>
+        <w:t>widely used</w:t>
       </w:r>
       <w:r>
         <w:t xml:space="preserve"> </w:t>
       </w:r>
       <w:r>
-        <w:t>widely used</w:t>
-      </w:r>
+        <w:t>in the</w:t>
+      </w:r>
+      <w:r>
+        <w:t xml:space="preserve"> industrial </w:t>
+      </w:r>
+      <w:r>
+        <w:t>field, such</w:t>
+      </w:r>
+      <w:r>
+        <w:t xml:space="preserve"> as </w:t>
+      </w:r>
+      <w:r>
+        <w:t>t</w:t>
+      </w:r>
+      <w:r>
+        <w:t>he servo control system, robots, and numerical control machine tool.</w:t>
+      </w:r>
+      <w:r>
+        <w:t xml:space="preserve"> However, it has a high installation cost and poor reliability due to the usage of multiple power supplies and communication cables.</w:t>
+      </w:r>
+    </w:p>
+    <w:p>
+      <w:pPr>
+        <w:pStyle w:val="ListParagraph"/>
+        <w:numPr>
+          <w:ilvl w:val="0"/>
+          <w:numId w:val="3"/>
+        </w:numPr>
+      </w:pPr>
+      <w:r>
+        <w:t xml:space="preserve">The </w:t>
+      </w:r>
+      <w:proofErr w:type="spellStart"/>
+      <w:r>
+        <w:t>EtherCAT</w:t>
+      </w:r>
+      <w:proofErr w:type="spellEnd"/>
       <w:r>
         <w:t xml:space="preserve"> </w:t>
       </w:r>
       <w:r>
-        <w:t>in the</w:t>
-      </w:r>
-      <w:r>
-        <w:t xml:space="preserve"> industrial </w:t>
-      </w:r>
-      <w:r>
-        <w:t>field, such</w:t>
-      </w:r>
-      <w:r>
-        <w:t xml:space="preserve"> as </w:t>
-      </w:r>
-      <w:r>
-        <w:t>t</w:t>
-      </w:r>
-      <w:r>
-        <w:t>he servo control system, robots, and numerical control machine tool.</w:t>
-      </w:r>
-      <w:r>
-        <w:t xml:space="preserve"> However, it has a </w:t>
-      </w:r>
-      <w:r>
-        <w:t>high installation cost and poor reliability</w:t>
-      </w:r>
-      <w:r>
-        <w:t xml:space="preserve"> due to the usage of multiple power supplies and communication cables.</w:t>
+        <w:t>P technology</w:t>
+      </w:r>
+      <w:r>
+        <w:t xml:space="preserve"> is an addition to </w:t>
+      </w:r>
+      <w:proofErr w:type="spellStart"/>
+      <w:r>
+        <w:t>EtherCAT</w:t>
+      </w:r>
+      <w:proofErr w:type="spellEnd"/>
+      <w:r>
+        <w:t xml:space="preserve">, </w:t>
+      </w:r>
+      <w:r>
+        <w:t>which can</w:t>
+      </w:r>
+      <w:r>
+        <w:t xml:space="preserve"> </w:t>
+      </w:r>
+      <w:r>
+        <w:t>enable the standard 4</w:t>
+      </w:r>
+      <w:r>
+        <w:t xml:space="preserve">-wire </w:t>
+      </w:r>
+      <w:r>
+        <w:t>Ethernet cable to transmit not</w:t>
+      </w:r>
+      <w:r>
+        <w:t xml:space="preserve"> </w:t>
+      </w:r>
+      <w:r>
+        <w:t>only data</w:t>
+      </w:r>
+      <w:r>
+        <w:t xml:space="preserve"> but </w:t>
+      </w:r>
+      <w:r>
+        <w:t>also two</w:t>
+      </w:r>
+      <w:r>
+        <w:t xml:space="preserve"> electrically isolated power supplies.</w:t>
       </w:r>
     </w:p>
     <w:p>
@@ -208,59 +200,7 @@
         </w:numPr>
       </w:pPr>
       <w:r>
-        <w:t xml:space="preserve">The </w:t>
-      </w:r>
-      <w:proofErr w:type="spellStart"/>
-      <w:r>
-        <w:t>EtherCAT</w:t>
-      </w:r>
-      <w:proofErr w:type="spellEnd"/>
-      <w:r>
-        <w:t xml:space="preserve"> </w:t>
-      </w:r>
-      <w:r>
-        <w:t>P technology</w:t>
-      </w:r>
-      <w:r>
-        <w:t xml:space="preserve"> is an addition to </w:t>
-      </w:r>
-      <w:proofErr w:type="spellStart"/>
-      <w:r>
-        <w:t>EtherCAT</w:t>
-      </w:r>
-      <w:proofErr w:type="spellEnd"/>
-      <w:r>
-        <w:t xml:space="preserve">, </w:t>
-      </w:r>
-      <w:r>
-        <w:t>which can</w:t>
-      </w:r>
-      <w:r>
-        <w:t xml:space="preserve"> </w:t>
-      </w:r>
-      <w:r>
-        <w:t>enable the standard 4</w:t>
-      </w:r>
-      <w:r>
-        <w:t xml:space="preserve">-wire </w:t>
-      </w:r>
-      <w:r>
-        <w:t>Ethernet cable to transmit not</w:t>
-      </w:r>
-      <w:r>
-        <w:t xml:space="preserve"> </w:t>
-      </w:r>
-      <w:r>
-        <w:t>only data</w:t>
-      </w:r>
-      <w:r>
-        <w:t xml:space="preserve"> but </w:t>
-      </w:r>
-      <w:r>
-        <w:t>also two</w:t>
-      </w:r>
-      <w:r>
-        <w:t xml:space="preserve"> electrically isolated power supplies.</w:t>
+        <w:t>It consists of two isolated power supplies; the system control power supply Us and the peripheral actuator power supply. Nominal voltage is 24V and current can be up to 3A.</w:t>
       </w:r>
     </w:p>
     <w:p>
@@ -272,22 +212,18 @@
         </w:numPr>
       </w:pPr>
       <w:r>
-        <w:t>It consists of two isolated power supplies; the system control power supply Us and the peripheral actuator power supply. Nominal voltage is 24V and current can be up to 3A.</w:t>
-      </w:r>
-    </w:p>
-    <w:p>
-      <w:pPr>
-        <w:pStyle w:val="ListParagraph"/>
-        <w:numPr>
-          <w:ilvl w:val="0"/>
-          <w:numId w:val="3"/>
-        </w:numPr>
-      </w:pPr>
-      <w:r>
-        <w:t>It is</w:t>
-      </w:r>
-      <w:r>
-        <w:t xml:space="preserve">  different  from  the  Power  over  Ethernet  (PoE), where only one  voltage  can  be transmitted</w:t>
+        <w:t xml:space="preserve">It </w:t>
+      </w:r>
+      <w:proofErr w:type="gramStart"/>
+      <w:r>
+        <w:t>is</w:t>
+      </w:r>
+      <w:r>
+        <w:t xml:space="preserve">  different</w:t>
+      </w:r>
+      <w:proofErr w:type="gramEnd"/>
+      <w:r>
+        <w:t xml:space="preserve">  from  the  Power  over  Ethernet  (PoE), where only one  voltage  can  be transmitted</w:t>
       </w:r>
       <w:r>
         <w:t>.</w:t>
@@ -391,21 +327,7 @@
           <w:rFonts w:eastAsia="Times New Roman"/>
           <w:color w:val="000000"/>
         </w:rPr>
-        <w:t xml:space="preserve">devices directly. </w:t>
-      </w:r>
-      <w:r>
-        <w:rPr>
-          <w:rFonts w:eastAsia="Times New Roman"/>
-          <w:color w:val="000000"/>
-        </w:rPr>
-        <w:t>For example</w:t>
-      </w:r>
-      <w:r>
-        <w:rPr>
-          <w:rFonts w:eastAsia="Times New Roman"/>
-          <w:color w:val="000000"/>
-        </w:rPr>
-        <w:t>, the transport medium usually uses class 5 UTP wires of the 100base-TX specification.</w:t>
+        <w:t>devices directly. For example, the transport medium usually uses class 5 UTP wires of the 100base-TX specification.</w:t>
       </w:r>
     </w:p>
     <w:p>
@@ -672,21 +594,15 @@
         <w:pStyle w:val="ListParagraph"/>
       </w:pPr>
       <w:r>
-        <w:t>48F-03GYD2NL</w:t>
-      </w:r>
-      <w:r>
-        <w:t>: $2.6</w:t>
-      </w:r>
-    </w:p>
-    <w:p>
-      <w:pPr>
-        <w:pStyle w:val="ListParagraph"/>
-      </w:pPr>
-      <w:r>
-        <w:t>HR915310A</w:t>
-      </w:r>
-      <w:r>
-        <w:t>: $1.6</w:t>
+        <w:t>48F-03GYD2NL: $2.6</w:t>
+      </w:r>
+    </w:p>
+    <w:p>
+      <w:pPr>
+        <w:pStyle w:val="ListParagraph"/>
+      </w:pPr>
+      <w:r>
+        <w:t>HR915310A: $1.6</w:t>
       </w:r>
     </w:p>
     <w:p>
@@ -867,16 +783,10 @@
       </w:pPr>
       <w:r>
         <w:lastRenderedPageBreak/>
-        <w:t>EEPROM</w:t>
-      </w:r>
-      <w:r>
-        <w:t>:</w:t>
-      </w:r>
-      <w:r>
-        <w:t xml:space="preserve"> </w:t>
-      </w:r>
-      <w:r>
-        <w:t>CAT24C256WI-GT3</w:t>
+        <w:t>EEPROM:</w:t>
+      </w:r>
+      <w:r>
+        <w:t xml:space="preserve"> CAT24C256WI-GT3</w:t>
       </w:r>
       <w:r>
         <w:t>: $0.3</w:t>
@@ -891,13 +801,7 @@
         </w:numPr>
       </w:pPr>
       <w:r>
-        <w:t xml:space="preserve">Optocoupler for isolation between control and drive circuit: </w:t>
-      </w:r>
-      <w:r>
-        <w:t>HCPL-4504-500E</w:t>
-      </w:r>
-      <w:r>
-        <w:t xml:space="preserve">  </w:t>
+        <w:t xml:space="preserve">Optocoupler for isolation between control and drive circuit: HCPL-4504-500E  </w:t>
       </w:r>
       <w:hyperlink r:id="rId5" w:history="1">
         <w:r>
@@ -1059,10 +963,7 @@
         </w:numPr>
       </w:pPr>
       <w:r>
-        <w:t>Hardware Data Sheet ET1100</w:t>
-      </w:r>
-      <w:r>
-        <w:t xml:space="preserve">: </w:t>
+        <w:t xml:space="preserve">Hardware Data Sheet ET1100: </w:t>
       </w:r>
       <w:hyperlink r:id="rId13" w:history="1">
         <w:r>
@@ -1114,7 +1015,19 @@
           <w:rPr>
             <w:rStyle w:val="Hyperlink"/>
           </w:rPr>
-          <w:t>https://www.infineon.com/dgdl/Infineon-Peripheral+-+EtherCAT+Slave+Controller+(ECAT)-TR-v01_00-EN.pdf?fileId=5546d4625696ed7601569c8617fb08ba</w:t>
+          <w:t>https:</w:t>
+        </w:r>
+        <w:r>
+          <w:rPr>
+            <w:rStyle w:val="Hyperlink"/>
+          </w:rPr>
+          <w:t>/</w:t>
+        </w:r>
+        <w:r>
+          <w:rPr>
+            <w:rStyle w:val="Hyperlink"/>
+          </w:rPr>
+          <w:t>/www.infineon.com/dgdl/Infineon-Peripheral+-+EtherCAT+Slave+Controller+(ECAT)-TR-v01_00-EN.pdf?fileId=5546d4625696ed7601569c8617fb08ba</w:t>
         </w:r>
       </w:hyperlink>
     </w:p>
@@ -1132,6 +1045,11 @@
       </w:hyperlink>
     </w:p>
     <w:p>
+      <w:pPr>
+        <w:rPr>
+          <w:rStyle w:val="Hyperlink"/>
+        </w:rPr>
+      </w:pPr>
       <w:proofErr w:type="spellStart"/>
       <w:r>
         <w:t>EtherCAT</w:t>
@@ -1146,6 +1064,628 @@
             <w:rStyle w:val="Hyperlink"/>
           </w:rPr>
           <w:t>https://www.microchip.com/en-us/product/LAN9252</w:t>
+        </w:r>
+      </w:hyperlink>
+    </w:p>
+    <w:p>
+      <w:pPr>
+        <w:pStyle w:val="Heading1"/>
+        <w:rPr>
+          <w:b/>
+          <w:bCs/>
+        </w:rPr>
+      </w:pPr>
+      <w:r>
+        <w:rPr>
+          <w:b/>
+          <w:bCs/>
+        </w:rPr>
+        <w:t>XMC4700</w:t>
+      </w:r>
+      <w:r>
+        <w:rPr>
+          <w:b/>
+          <w:bCs/>
+        </w:rPr>
+        <w:t>:</w:t>
+      </w:r>
+    </w:p>
+    <w:p>
+      <w:pPr>
+        <w:pStyle w:val="ListParagraph"/>
+        <w:numPr>
+          <w:ilvl w:val="0"/>
+          <w:numId w:val="5"/>
+        </w:numPr>
+      </w:pPr>
+      <w:hyperlink r:id="rId17" w:history="1">
+        <w:r>
+          <w:rPr>
+            <w:rStyle w:val="Hyperlink"/>
+          </w:rPr>
+          <w:t>XMC4700 refere</w:t>
+        </w:r>
+        <w:r>
+          <w:rPr>
+            <w:rStyle w:val="Hyperlink"/>
+          </w:rPr>
+          <w:t>n</w:t>
+        </w:r>
+        <w:r>
+          <w:rPr>
+            <w:rStyle w:val="Hyperlink"/>
+          </w:rPr>
+          <w:t>c</w:t>
+        </w:r>
+        <w:r>
+          <w:rPr>
+            <w:rStyle w:val="Hyperlink"/>
+          </w:rPr>
+          <w:t>e</w:t>
+        </w:r>
+        <w:r>
+          <w:rPr>
+            <w:rStyle w:val="Hyperlink"/>
+          </w:rPr>
+          <w:t xml:space="preserve"> design</w:t>
+        </w:r>
+      </w:hyperlink>
+    </w:p>
+    <w:p>
+      <w:pPr>
+        <w:pStyle w:val="ListParagraph"/>
+        <w:numPr>
+          <w:ilvl w:val="0"/>
+          <w:numId w:val="5"/>
+        </w:numPr>
+      </w:pPr>
+      <w:r>
+        <w:t>KSZ8081RNDCA-TR</w:t>
+      </w:r>
+      <w:r>
+        <w:t>: Ethernet transceiver $1.26</w:t>
+      </w:r>
+    </w:p>
+    <w:p>
+      <w:pPr>
+        <w:pStyle w:val="ListParagraph"/>
+        <w:numPr>
+          <w:ilvl w:val="0"/>
+          <w:numId w:val="5"/>
+        </w:numPr>
+      </w:pPr>
+      <w:r>
+        <w:t xml:space="preserve">Debugging header: </w:t>
+      </w:r>
+      <w:r>
+        <w:t>FTSH-105-01-F-D-K</w:t>
+      </w:r>
+      <w:r>
+        <w:t xml:space="preserve"> $2.43</w:t>
+      </w:r>
+    </w:p>
+    <w:p>
+      <w:pPr>
+        <w:pStyle w:val="ListParagraph"/>
+        <w:numPr>
+          <w:ilvl w:val="0"/>
+          <w:numId w:val="5"/>
+        </w:numPr>
+      </w:pPr>
+      <w:hyperlink r:id="rId18" w:anchor="!documents" w:history="1">
+        <w:r>
+          <w:rPr>
+            <w:rStyle w:val="Hyperlink"/>
+          </w:rPr>
+          <w:t>Resources of KIT_XMC47_RELAX_V1</w:t>
+        </w:r>
+      </w:hyperlink>
+    </w:p>
+    <w:p>
+      <w:pPr>
+        <w:pStyle w:val="ListParagraph"/>
+        <w:numPr>
+          <w:ilvl w:val="0"/>
+          <w:numId w:val="5"/>
+        </w:numPr>
+      </w:pPr>
+      <w:hyperlink r:id="rId19" w:history="1">
+        <w:r>
+          <w:rPr>
+            <w:rStyle w:val="Hyperlink"/>
+          </w:rPr>
+          <w:t>XMC4700 Documents</w:t>
+        </w:r>
+      </w:hyperlink>
+    </w:p>
+    <w:p>
+      <w:pPr>
+        <w:pStyle w:val="ListParagraph"/>
+        <w:numPr>
+          <w:ilvl w:val="0"/>
+          <w:numId w:val="5"/>
+        </w:numPr>
+      </w:pPr>
+      <w:hyperlink r:id="rId20" w:history="1">
+        <w:r>
+          <w:rPr>
+            <w:rStyle w:val="Hyperlink"/>
+          </w:rPr>
+          <w:t>Infineon/mtb-example-xmc-ccu8-pwm-complementary</w:t>
+        </w:r>
+      </w:hyperlink>
+    </w:p>
+    <w:p>
+      <w:pPr>
+        <w:pStyle w:val="ListParagraph"/>
+        <w:numPr>
+          <w:ilvl w:val="0"/>
+          <w:numId w:val="5"/>
+        </w:numPr>
+      </w:pPr>
+      <w:hyperlink r:id="rId21" w:history="1">
+        <w:r>
+          <w:rPr>
+            <w:rStyle w:val="Hyperlink"/>
+          </w:rPr>
+          <w:t>https://github.com/Infineon/mtb-example-xmc-empty-app</w:t>
+        </w:r>
+      </w:hyperlink>
+    </w:p>
+    <w:p>
+      <w:pPr>
+        <w:pStyle w:val="Heading1"/>
+        <w:rPr>
+          <w:b/>
+          <w:bCs/>
+        </w:rPr>
+      </w:pPr>
+      <w:r>
+        <w:rPr>
+          <w:b/>
+          <w:bCs/>
+        </w:rPr>
+        <w:t>Comparison Between AMIC And XMC</w:t>
+      </w:r>
+    </w:p>
+    <w:p>
+      <w:pPr>
+        <w:pStyle w:val="Heading2"/>
+        <w:rPr>
+          <w:b/>
+          <w:bCs/>
+        </w:rPr>
+      </w:pPr>
+      <w:r>
+        <w:rPr>
+          <w:b/>
+          <w:bCs/>
+        </w:rPr>
+        <w:t>AMIC:</w:t>
+      </w:r>
+    </w:p>
+    <w:p>
+      <w:pPr>
+        <w:pStyle w:val="ListParagraph"/>
+        <w:numPr>
+          <w:ilvl w:val="0"/>
+          <w:numId w:val="6"/>
+        </w:numPr>
+      </w:pPr>
+      <w:r>
+        <w:t>Up to 300-MHz Sitara™ ARM® Cortex® -A8 32</w:t>
+      </w:r>
+      <w:r>
+        <w:noBreakHyphen/>
+        <w:t>Bit RISC Processor</w:t>
+      </w:r>
+    </w:p>
+    <w:p>
+      <w:pPr>
+        <w:pStyle w:val="ListParagraph"/>
+        <w:numPr>
+          <w:ilvl w:val="0"/>
+          <w:numId w:val="6"/>
+        </w:numPr>
+      </w:pPr>
+      <w:r>
+        <w:t xml:space="preserve">Two MII Ethernet Ports that Support Industrial Ethernet, such as </w:t>
+      </w:r>
+      <w:proofErr w:type="spellStart"/>
+      <w:r>
+        <w:t>EtherCAT</w:t>
+      </w:r>
+      <w:proofErr w:type="spellEnd"/>
+    </w:p>
+    <w:p>
+      <w:pPr>
+        <w:pStyle w:val="ListParagraph"/>
+        <w:numPr>
+          <w:ilvl w:val="0"/>
+          <w:numId w:val="6"/>
+        </w:numPr>
+      </w:pPr>
+      <w:r>
+        <w:t>Up to Two USB 2.0 High-Speed DRD (</w:t>
+      </w:r>
+      <w:proofErr w:type="spellStart"/>
+      <w:r>
+        <w:t>DualRole</w:t>
+      </w:r>
+      <w:proofErr w:type="spellEnd"/>
+      <w:r>
+        <w:t xml:space="preserve"> Device) Ports </w:t>
+      </w:r>
+      <w:proofErr w:type="gramStart"/>
+      <w:r>
+        <w:t>With</w:t>
+      </w:r>
+      <w:proofErr w:type="gramEnd"/>
+      <w:r>
+        <w:t xml:space="preserve"> Integrated PHY</w:t>
+      </w:r>
+    </w:p>
+    <w:p>
+      <w:pPr>
+        <w:pStyle w:val="ListParagraph"/>
+        <w:numPr>
+          <w:ilvl w:val="0"/>
+          <w:numId w:val="6"/>
+        </w:numPr>
+      </w:pPr>
+      <w:r>
+        <w:lastRenderedPageBreak/>
+        <w:t>Up to Two Industrial Gigabit Ethernet MACs (10,100, 1000 Mbps)</w:t>
+      </w:r>
+      <w:r>
+        <w:t xml:space="preserve"> </w:t>
+      </w:r>
+      <w:r>
+        <w:t>Integrated Switch</w:t>
+      </w:r>
+      <w:r>
+        <w:t xml:space="preserve">. </w:t>
+      </w:r>
+      <w:r>
+        <w:t>Each MAC Supports MII, RMII, RGMII, and</w:t>
+      </w:r>
+      <w:r>
+        <w:t xml:space="preserve"> </w:t>
+      </w:r>
+      <w:r>
+        <w:t>MDIO Interfaces</w:t>
+      </w:r>
+    </w:p>
+    <w:p>
+      <w:pPr>
+        <w:pStyle w:val="ListParagraph"/>
+        <w:numPr>
+          <w:ilvl w:val="0"/>
+          <w:numId w:val="6"/>
+        </w:numPr>
+      </w:pPr>
+      <w:r>
+        <w:t>Ethernet MACs and Switch Can Operate</w:t>
+      </w:r>
+      <w:r>
+        <w:t xml:space="preserve"> </w:t>
+      </w:r>
+      <w:r>
+        <w:t>Independent of Other Functions</w:t>
+      </w:r>
+      <w:r>
+        <w:cr/>
+      </w:r>
+    </w:p>
+    <w:p>
+      <w:pPr>
+        <w:pStyle w:val="ListParagraph"/>
+        <w:numPr>
+          <w:ilvl w:val="0"/>
+          <w:numId w:val="6"/>
+        </w:numPr>
+      </w:pPr>
+      <w:r>
+        <w:t>Has 2 CAN, 6 UART, 3 I2C</w:t>
+      </w:r>
+      <w:r>
+        <w:t>, 2 SPI</w:t>
+      </w:r>
+      <w:r>
+        <w:t xml:space="preserve"> and 4 banks of GPIO (each bank has 32 </w:t>
+      </w:r>
+      <w:proofErr w:type="spellStart"/>
+      <w:r>
+        <w:t>gpios</w:t>
+      </w:r>
+      <w:proofErr w:type="spellEnd"/>
+      <w:r>
+        <w:t xml:space="preserve">), </w:t>
+      </w:r>
+      <w:r>
+        <w:t>– Eight 32-Bit General-Purpose Timers</w:t>
+      </w:r>
+      <w:r>
+        <w:t xml:space="preserve">, </w:t>
+      </w:r>
+      <w:r>
+        <w:t>Three Enhanced High-Resolution PWM</w:t>
+      </w:r>
+      <w:r>
+        <w:t xml:space="preserve"> </w:t>
+      </w:r>
+      <w:r>
+        <w:t>Modules</w:t>
+      </w:r>
+    </w:p>
+    <w:p>
+      <w:pPr>
+        <w:pStyle w:val="ListParagraph"/>
+        <w:numPr>
+          <w:ilvl w:val="0"/>
+          <w:numId w:val="6"/>
+        </w:numPr>
+      </w:pPr>
+      <w:r>
+        <w:t>12-Bit Successive Approximation Register (SAR) ADC</w:t>
+      </w:r>
+    </w:p>
+    <w:p>
+      <w:pPr>
+        <w:pStyle w:val="ListParagraph"/>
+        <w:numPr>
+          <w:ilvl w:val="0"/>
+          <w:numId w:val="6"/>
+        </w:numPr>
+      </w:pPr>
+      <w:r>
+        <w:t xml:space="preserve">Available </w:t>
+      </w:r>
+      <w:r>
+        <w:t>Package: – 324-Pin S-PBGA-N324 Package</w:t>
+      </w:r>
+    </w:p>
+    <w:p>
+      <w:pPr>
+        <w:pStyle w:val="Heading2"/>
+        <w:rPr>
+          <w:b/>
+          <w:bCs/>
+        </w:rPr>
+      </w:pPr>
+      <w:r>
+        <w:rPr>
+          <w:b/>
+          <w:bCs/>
+        </w:rPr>
+        <w:t>XMC:</w:t>
+      </w:r>
+    </w:p>
+    <w:p>
+      <w:pPr>
+        <w:pStyle w:val="ListParagraph"/>
+        <w:numPr>
+          <w:ilvl w:val="0"/>
+          <w:numId w:val="8"/>
+        </w:numPr>
+      </w:pPr>
+      <w:r>
+        <w:t>ARM Cortex-M4 processor core</w:t>
+      </w:r>
+    </w:p>
+    <w:p>
+      <w:pPr>
+        <w:pStyle w:val="ListParagraph"/>
+        <w:numPr>
+          <w:ilvl w:val="0"/>
+          <w:numId w:val="7"/>
+        </w:numPr>
+      </w:pPr>
+      <w:r>
+        <w:t>Ethernet MAC module capable of 10/100 Mbit/s transfer rates</w:t>
+      </w:r>
+    </w:p>
+    <w:p>
+      <w:pPr>
+        <w:pStyle w:val="ListParagraph"/>
+        <w:numPr>
+          <w:ilvl w:val="0"/>
+          <w:numId w:val="7"/>
+        </w:numPr>
+      </w:pPr>
+      <w:proofErr w:type="spellStart"/>
+      <w:r>
+        <w:t>EtherCATSlave</w:t>
+      </w:r>
+      <w:proofErr w:type="spellEnd"/>
+      <w:r>
+        <w:t xml:space="preserve"> interface (ECAT) capable of 100 Mbit/s transfer rates with 2 MII</w:t>
+      </w:r>
+      <w:r>
+        <w:t xml:space="preserve"> </w:t>
+      </w:r>
+      <w:r>
+        <w:t>ports, 8 Fieldbus</w:t>
+      </w:r>
+      <w:r>
+        <w:t xml:space="preserve"> </w:t>
+      </w:r>
+      <w:r>
+        <w:t xml:space="preserve">Memory Management Units (FMMU), 8 Sync Manager, </w:t>
+      </w:r>
+      <w:r>
+        <w:t xml:space="preserve">64-bit </w:t>
+      </w:r>
+      <w:r>
+        <w:t>distributed clocks</w:t>
+      </w:r>
+    </w:p>
+    <w:p>
+      <w:pPr>
+        <w:pStyle w:val="ListParagraph"/>
+        <w:numPr>
+          <w:ilvl w:val="0"/>
+          <w:numId w:val="7"/>
+        </w:numPr>
+      </w:pPr>
+      <w:r>
+        <w:t>Universal Serial Bus, USB 2.0 host, Full-Speed OTG, with integrated PHY</w:t>
+      </w:r>
+    </w:p>
+    <w:p>
+      <w:pPr>
+        <w:pStyle w:val="ListParagraph"/>
+        <w:numPr>
+          <w:ilvl w:val="0"/>
+          <w:numId w:val="7"/>
+        </w:numPr>
+      </w:pPr>
+      <w:r>
+        <w:t>Controller Area Network interface (</w:t>
+      </w:r>
+      <w:proofErr w:type="spellStart"/>
+      <w:r>
+        <w:t>MultiCAN</w:t>
+      </w:r>
+      <w:proofErr w:type="spellEnd"/>
+      <w:r>
+        <w:t>), Full-CAN/Basic-CAN with 6 nodes,</w:t>
+      </w:r>
+      <w:r>
+        <w:t xml:space="preserve"> </w:t>
+      </w:r>
+      <w:r>
+        <w:t xml:space="preserve">256 message objects (MO), data rate up to 1 </w:t>
+      </w:r>
+      <w:proofErr w:type="spellStart"/>
+      <w:r>
+        <w:t>MBaud</w:t>
+      </w:r>
+      <w:proofErr w:type="spellEnd"/>
+    </w:p>
+    <w:p>
+      <w:pPr>
+        <w:pStyle w:val="ListParagraph"/>
+        <w:numPr>
+          <w:ilvl w:val="0"/>
+          <w:numId w:val="7"/>
+        </w:numPr>
+      </w:pPr>
+      <w:r>
+        <w:t>Six Universal Serial Interface Channels (USIC</w:t>
+      </w:r>
+      <w:r>
+        <w:t>), providing</w:t>
+      </w:r>
+      <w:r>
+        <w:t xml:space="preserve"> 6 serial channels, usable as</w:t>
+      </w:r>
+      <w:r>
+        <w:t xml:space="preserve"> </w:t>
+      </w:r>
+      <w:r>
+        <w:t>UART, double-SPI, quad-SPI, IIC, IIS and LIN interfaces</w:t>
+      </w:r>
+    </w:p>
+    <w:p>
+      <w:pPr>
+        <w:pStyle w:val="ListParagraph"/>
+        <w:numPr>
+          <w:ilvl w:val="0"/>
+          <w:numId w:val="7"/>
+        </w:numPr>
+      </w:pPr>
+      <w:r>
+        <w:t>Four Analog-Digital Converters (VADC) of 12-bit resolution, 8 channels each, with input out-of-range comparators</w:t>
+      </w:r>
+    </w:p>
+    <w:p>
+      <w:pPr>
+        <w:pStyle w:val="Heading1"/>
+        <w:rPr>
+          <w:b/>
+          <w:bCs/>
+        </w:rPr>
+      </w:pPr>
+      <w:r>
+        <w:rPr>
+          <w:b/>
+          <w:bCs/>
+        </w:rPr>
+        <w:t>Other MCU options:</w:t>
+      </w:r>
+    </w:p>
+    <w:p>
+      <w:r>
+        <w:t>AM3352BZCE30</w:t>
+      </w:r>
+      <w:r>
+        <w:t xml:space="preserve"> $</w:t>
+      </w:r>
+      <w:r>
+        <w:t>6</w:t>
+      </w:r>
+      <w:r>
+        <w:t>-15 (different price on different sites)</w:t>
+      </w:r>
+    </w:p>
+    <w:p>
+      <w:r>
+        <w:t>R5F572MNDDBG#20</w:t>
+      </w:r>
+      <w:r>
+        <w:t xml:space="preserve"> (</w:t>
+      </w:r>
+      <w:r>
+        <w:t>$17-</w:t>
+      </w:r>
+      <w:r>
+        <w:t>23)</w:t>
+      </w:r>
+    </w:p>
+    <w:p>
+      <w:hyperlink r:id="rId22" w:history="1">
+        <w:r>
+          <w:rPr>
+            <w:rStyle w:val="Hyperlink"/>
+          </w:rPr>
+          <w:t>LAN9255-I/ZMX019</w:t>
+        </w:r>
+      </w:hyperlink>
+      <w:r>
+        <w:t xml:space="preserve"> ($17)</w:t>
+      </w:r>
+    </w:p>
+    <w:p>
+      <w:r>
+        <w:t xml:space="preserve">The LAN9255 is a System-In-Package (SIP) design that combines the Microchip LAN9253 2/3-port </w:t>
+      </w:r>
+      <w:proofErr w:type="spellStart"/>
+      <w:r>
+        <w:t>EtherCAT</w:t>
+      </w:r>
+      <w:proofErr w:type="spellEnd"/>
+      <w:r>
+        <w:t xml:space="preserve"> device controller with dual integrated Ethernet PHYs and the Microchip SAM E53J ARM Cortex-M4F MCU into a single 128- pin TQFP package.</w:t>
+      </w:r>
+    </w:p>
+    <w:p>
+      <w:hyperlink r:id="rId23" w:history="1">
+        <w:r>
+          <w:rPr>
+            <w:rStyle w:val="Hyperlink"/>
+          </w:rPr>
+          <w:t>EVAL board</w:t>
+        </w:r>
+      </w:hyperlink>
+    </w:p>
+    <w:p>
+      <w:hyperlink r:id="rId24" w:history="1">
+        <w:r>
+          <w:rPr>
+            <w:rStyle w:val="Hyperlink"/>
+          </w:rPr>
+          <w:t>file:///D:/eSpark/Docs/EVB-LAN9255-Users-Guide-50003106.pdf</w:t>
         </w:r>
       </w:hyperlink>
     </w:p>
@@ -1276,6 +1816,232 @@
     </w:lvl>
   </w:abstractNum>
   <w:abstractNum w:abstractNumId="1" w15:restartNumberingAfterBreak="0">
+    <w:nsid w:val="119B0DD3"/>
+    <w:multiLevelType w:val="hybridMultilevel"/>
+    <w:tmpl w:val="34BC6F36"/>
+    <w:lvl w:ilvl="0" w:tplc="04090001">
+      <w:start w:val="1"/>
+      <w:numFmt w:val="bullet"/>
+      <w:lvlText w:val=""/>
+      <w:lvlJc w:val="left"/>
+      <w:pPr>
+        <w:ind w:left="720" w:hanging="360"/>
+      </w:pPr>
+      <w:rPr>
+        <w:rFonts w:ascii="Symbol" w:hAnsi="Symbol" w:hint="default"/>
+      </w:rPr>
+    </w:lvl>
+    <w:lvl w:ilvl="1" w:tplc="04090003" w:tentative="1">
+      <w:start w:val="1"/>
+      <w:numFmt w:val="bullet"/>
+      <w:lvlText w:val="o"/>
+      <w:lvlJc w:val="left"/>
+      <w:pPr>
+        <w:ind w:left="1440" w:hanging="360"/>
+      </w:pPr>
+      <w:rPr>
+        <w:rFonts w:ascii="Courier New" w:hAnsi="Courier New" w:cs="Courier New" w:hint="default"/>
+      </w:rPr>
+    </w:lvl>
+    <w:lvl w:ilvl="2" w:tplc="04090005" w:tentative="1">
+      <w:start w:val="1"/>
+      <w:numFmt w:val="bullet"/>
+      <w:lvlText w:val=""/>
+      <w:lvlJc w:val="left"/>
+      <w:pPr>
+        <w:ind w:left="2160" w:hanging="360"/>
+      </w:pPr>
+      <w:rPr>
+        <w:rFonts w:ascii="Wingdings" w:hAnsi="Wingdings" w:hint="default"/>
+      </w:rPr>
+    </w:lvl>
+    <w:lvl w:ilvl="3" w:tplc="04090001" w:tentative="1">
+      <w:start w:val="1"/>
+      <w:numFmt w:val="bullet"/>
+      <w:lvlText w:val=""/>
+      <w:lvlJc w:val="left"/>
+      <w:pPr>
+        <w:ind w:left="2880" w:hanging="360"/>
+      </w:pPr>
+      <w:rPr>
+        <w:rFonts w:ascii="Symbol" w:hAnsi="Symbol" w:hint="default"/>
+      </w:rPr>
+    </w:lvl>
+    <w:lvl w:ilvl="4" w:tplc="04090003" w:tentative="1">
+      <w:start w:val="1"/>
+      <w:numFmt w:val="bullet"/>
+      <w:lvlText w:val="o"/>
+      <w:lvlJc w:val="left"/>
+      <w:pPr>
+        <w:ind w:left="3600" w:hanging="360"/>
+      </w:pPr>
+      <w:rPr>
+        <w:rFonts w:ascii="Courier New" w:hAnsi="Courier New" w:cs="Courier New" w:hint="default"/>
+      </w:rPr>
+    </w:lvl>
+    <w:lvl w:ilvl="5" w:tplc="04090005" w:tentative="1">
+      <w:start w:val="1"/>
+      <w:numFmt w:val="bullet"/>
+      <w:lvlText w:val=""/>
+      <w:lvlJc w:val="left"/>
+      <w:pPr>
+        <w:ind w:left="4320" w:hanging="360"/>
+      </w:pPr>
+      <w:rPr>
+        <w:rFonts w:ascii="Wingdings" w:hAnsi="Wingdings" w:hint="default"/>
+      </w:rPr>
+    </w:lvl>
+    <w:lvl w:ilvl="6" w:tplc="04090001" w:tentative="1">
+      <w:start w:val="1"/>
+      <w:numFmt w:val="bullet"/>
+      <w:lvlText w:val=""/>
+      <w:lvlJc w:val="left"/>
+      <w:pPr>
+        <w:ind w:left="5040" w:hanging="360"/>
+      </w:pPr>
+      <w:rPr>
+        <w:rFonts w:ascii="Symbol" w:hAnsi="Symbol" w:hint="default"/>
+      </w:rPr>
+    </w:lvl>
+    <w:lvl w:ilvl="7" w:tplc="04090003" w:tentative="1">
+      <w:start w:val="1"/>
+      <w:numFmt w:val="bullet"/>
+      <w:lvlText w:val="o"/>
+      <w:lvlJc w:val="left"/>
+      <w:pPr>
+        <w:ind w:left="5760" w:hanging="360"/>
+      </w:pPr>
+      <w:rPr>
+        <w:rFonts w:ascii="Courier New" w:hAnsi="Courier New" w:cs="Courier New" w:hint="default"/>
+      </w:rPr>
+    </w:lvl>
+    <w:lvl w:ilvl="8" w:tplc="04090005" w:tentative="1">
+      <w:start w:val="1"/>
+      <w:numFmt w:val="bullet"/>
+      <w:lvlText w:val=""/>
+      <w:lvlJc w:val="left"/>
+      <w:pPr>
+        <w:ind w:left="6480" w:hanging="360"/>
+      </w:pPr>
+      <w:rPr>
+        <w:rFonts w:ascii="Wingdings" w:hAnsi="Wingdings" w:hint="default"/>
+      </w:rPr>
+    </w:lvl>
+  </w:abstractNum>
+  <w:abstractNum w:abstractNumId="2" w15:restartNumberingAfterBreak="0">
+    <w:nsid w:val="13920A74"/>
+    <w:multiLevelType w:val="hybridMultilevel"/>
+    <w:tmpl w:val="7BEED292"/>
+    <w:lvl w:ilvl="0" w:tplc="04090001">
+      <w:start w:val="1"/>
+      <w:numFmt w:val="bullet"/>
+      <w:lvlText w:val=""/>
+      <w:lvlJc w:val="left"/>
+      <w:pPr>
+        <w:ind w:left="720" w:hanging="360"/>
+      </w:pPr>
+      <w:rPr>
+        <w:rFonts w:ascii="Symbol" w:hAnsi="Symbol" w:hint="default"/>
+      </w:rPr>
+    </w:lvl>
+    <w:lvl w:ilvl="1" w:tplc="04090003" w:tentative="1">
+      <w:start w:val="1"/>
+      <w:numFmt w:val="bullet"/>
+      <w:lvlText w:val="o"/>
+      <w:lvlJc w:val="left"/>
+      <w:pPr>
+        <w:ind w:left="1440" w:hanging="360"/>
+      </w:pPr>
+      <w:rPr>
+        <w:rFonts w:ascii="Courier New" w:hAnsi="Courier New" w:cs="Courier New" w:hint="default"/>
+      </w:rPr>
+    </w:lvl>
+    <w:lvl w:ilvl="2" w:tplc="04090005" w:tentative="1">
+      <w:start w:val="1"/>
+      <w:numFmt w:val="bullet"/>
+      <w:lvlText w:val=""/>
+      <w:lvlJc w:val="left"/>
+      <w:pPr>
+        <w:ind w:left="2160" w:hanging="360"/>
+      </w:pPr>
+      <w:rPr>
+        <w:rFonts w:ascii="Wingdings" w:hAnsi="Wingdings" w:hint="default"/>
+      </w:rPr>
+    </w:lvl>
+    <w:lvl w:ilvl="3" w:tplc="04090001" w:tentative="1">
+      <w:start w:val="1"/>
+      <w:numFmt w:val="bullet"/>
+      <w:lvlText w:val=""/>
+      <w:lvlJc w:val="left"/>
+      <w:pPr>
+        <w:ind w:left="2880" w:hanging="360"/>
+      </w:pPr>
+      <w:rPr>
+        <w:rFonts w:ascii="Symbol" w:hAnsi="Symbol" w:hint="default"/>
+      </w:rPr>
+    </w:lvl>
+    <w:lvl w:ilvl="4" w:tplc="04090003" w:tentative="1">
+      <w:start w:val="1"/>
+      <w:numFmt w:val="bullet"/>
+      <w:lvlText w:val="o"/>
+      <w:lvlJc w:val="left"/>
+      <w:pPr>
+        <w:ind w:left="3600" w:hanging="360"/>
+      </w:pPr>
+      <w:rPr>
+        <w:rFonts w:ascii="Courier New" w:hAnsi="Courier New" w:cs="Courier New" w:hint="default"/>
+      </w:rPr>
+    </w:lvl>
+    <w:lvl w:ilvl="5" w:tplc="04090005" w:tentative="1">
+      <w:start w:val="1"/>
+      <w:numFmt w:val="bullet"/>
+      <w:lvlText w:val=""/>
+      <w:lvlJc w:val="left"/>
+      <w:pPr>
+        <w:ind w:left="4320" w:hanging="360"/>
+      </w:pPr>
+      <w:rPr>
+        <w:rFonts w:ascii="Wingdings" w:hAnsi="Wingdings" w:hint="default"/>
+      </w:rPr>
+    </w:lvl>
+    <w:lvl w:ilvl="6" w:tplc="04090001" w:tentative="1">
+      <w:start w:val="1"/>
+      <w:numFmt w:val="bullet"/>
+      <w:lvlText w:val=""/>
+      <w:lvlJc w:val="left"/>
+      <w:pPr>
+        <w:ind w:left="5040" w:hanging="360"/>
+      </w:pPr>
+      <w:rPr>
+        <w:rFonts w:ascii="Symbol" w:hAnsi="Symbol" w:hint="default"/>
+      </w:rPr>
+    </w:lvl>
+    <w:lvl w:ilvl="7" w:tplc="04090003" w:tentative="1">
+      <w:start w:val="1"/>
+      <w:numFmt w:val="bullet"/>
+      <w:lvlText w:val="o"/>
+      <w:lvlJc w:val="left"/>
+      <w:pPr>
+        <w:ind w:left="5760" w:hanging="360"/>
+      </w:pPr>
+      <w:rPr>
+        <w:rFonts w:ascii="Courier New" w:hAnsi="Courier New" w:cs="Courier New" w:hint="default"/>
+      </w:rPr>
+    </w:lvl>
+    <w:lvl w:ilvl="8" w:tplc="04090005" w:tentative="1">
+      <w:start w:val="1"/>
+      <w:numFmt w:val="bullet"/>
+      <w:lvlText w:val=""/>
+      <w:lvlJc w:val="left"/>
+      <w:pPr>
+        <w:ind w:left="6480" w:hanging="360"/>
+      </w:pPr>
+      <w:rPr>
+        <w:rFonts w:ascii="Wingdings" w:hAnsi="Wingdings" w:hint="default"/>
+      </w:rPr>
+    </w:lvl>
+  </w:abstractNum>
+  <w:abstractNum w:abstractNumId="3" w15:restartNumberingAfterBreak="0">
     <w:nsid w:val="200400B2"/>
     <w:multiLevelType w:val="hybridMultilevel"/>
     <w:tmpl w:val="C3008188"/>
@@ -1361,7 +2127,7 @@
       </w:pPr>
     </w:lvl>
   </w:abstractNum>
-  <w:abstractNum w:abstractNumId="2" w15:restartNumberingAfterBreak="0">
+  <w:abstractNum w:abstractNumId="4" w15:restartNumberingAfterBreak="0">
     <w:nsid w:val="4966180B"/>
     <w:multiLevelType w:val="hybridMultilevel"/>
     <w:tmpl w:val="24E26478"/>
@@ -1474,7 +2240,7 @@
       </w:rPr>
     </w:lvl>
   </w:abstractNum>
-  <w:abstractNum w:abstractNumId="3" w15:restartNumberingAfterBreak="0">
+  <w:abstractNum w:abstractNumId="5" w15:restartNumberingAfterBreak="0">
     <w:nsid w:val="52A66894"/>
     <w:multiLevelType w:val="hybridMultilevel"/>
     <w:tmpl w:val="9FA8A11C"/>
@@ -1587,17 +2353,255 @@
       </w:rPr>
     </w:lvl>
   </w:abstractNum>
+  <w:abstractNum w:abstractNumId="6" w15:restartNumberingAfterBreak="0">
+    <w:nsid w:val="60AD2583"/>
+    <w:multiLevelType w:val="hybridMultilevel"/>
+    <w:tmpl w:val="FDF8C6F4"/>
+    <w:lvl w:ilvl="0" w:tplc="04090001">
+      <w:start w:val="1"/>
+      <w:numFmt w:val="bullet"/>
+      <w:lvlText w:val=""/>
+      <w:lvlJc w:val="left"/>
+      <w:pPr>
+        <w:ind w:left="720" w:hanging="360"/>
+      </w:pPr>
+      <w:rPr>
+        <w:rFonts w:ascii="Symbol" w:hAnsi="Symbol" w:hint="default"/>
+      </w:rPr>
+    </w:lvl>
+    <w:lvl w:ilvl="1" w:tplc="04090003" w:tentative="1">
+      <w:start w:val="1"/>
+      <w:numFmt w:val="bullet"/>
+      <w:lvlText w:val="o"/>
+      <w:lvlJc w:val="left"/>
+      <w:pPr>
+        <w:ind w:left="1440" w:hanging="360"/>
+      </w:pPr>
+      <w:rPr>
+        <w:rFonts w:ascii="Courier New" w:hAnsi="Courier New" w:cs="Courier New" w:hint="default"/>
+      </w:rPr>
+    </w:lvl>
+    <w:lvl w:ilvl="2" w:tplc="04090005" w:tentative="1">
+      <w:start w:val="1"/>
+      <w:numFmt w:val="bullet"/>
+      <w:lvlText w:val=""/>
+      <w:lvlJc w:val="left"/>
+      <w:pPr>
+        <w:ind w:left="2160" w:hanging="360"/>
+      </w:pPr>
+      <w:rPr>
+        <w:rFonts w:ascii="Wingdings" w:hAnsi="Wingdings" w:hint="default"/>
+      </w:rPr>
+    </w:lvl>
+    <w:lvl w:ilvl="3" w:tplc="04090001" w:tentative="1">
+      <w:start w:val="1"/>
+      <w:numFmt w:val="bullet"/>
+      <w:lvlText w:val=""/>
+      <w:lvlJc w:val="left"/>
+      <w:pPr>
+        <w:ind w:left="2880" w:hanging="360"/>
+      </w:pPr>
+      <w:rPr>
+        <w:rFonts w:ascii="Symbol" w:hAnsi="Symbol" w:hint="default"/>
+      </w:rPr>
+    </w:lvl>
+    <w:lvl w:ilvl="4" w:tplc="04090003" w:tentative="1">
+      <w:start w:val="1"/>
+      <w:numFmt w:val="bullet"/>
+      <w:lvlText w:val="o"/>
+      <w:lvlJc w:val="left"/>
+      <w:pPr>
+        <w:ind w:left="3600" w:hanging="360"/>
+      </w:pPr>
+      <w:rPr>
+        <w:rFonts w:ascii="Courier New" w:hAnsi="Courier New" w:cs="Courier New" w:hint="default"/>
+      </w:rPr>
+    </w:lvl>
+    <w:lvl w:ilvl="5" w:tplc="04090005" w:tentative="1">
+      <w:start w:val="1"/>
+      <w:numFmt w:val="bullet"/>
+      <w:lvlText w:val=""/>
+      <w:lvlJc w:val="left"/>
+      <w:pPr>
+        <w:ind w:left="4320" w:hanging="360"/>
+      </w:pPr>
+      <w:rPr>
+        <w:rFonts w:ascii="Wingdings" w:hAnsi="Wingdings" w:hint="default"/>
+      </w:rPr>
+    </w:lvl>
+    <w:lvl w:ilvl="6" w:tplc="04090001" w:tentative="1">
+      <w:start w:val="1"/>
+      <w:numFmt w:val="bullet"/>
+      <w:lvlText w:val=""/>
+      <w:lvlJc w:val="left"/>
+      <w:pPr>
+        <w:ind w:left="5040" w:hanging="360"/>
+      </w:pPr>
+      <w:rPr>
+        <w:rFonts w:ascii="Symbol" w:hAnsi="Symbol" w:hint="default"/>
+      </w:rPr>
+    </w:lvl>
+    <w:lvl w:ilvl="7" w:tplc="04090003" w:tentative="1">
+      <w:start w:val="1"/>
+      <w:numFmt w:val="bullet"/>
+      <w:lvlText w:val="o"/>
+      <w:lvlJc w:val="left"/>
+      <w:pPr>
+        <w:ind w:left="5760" w:hanging="360"/>
+      </w:pPr>
+      <w:rPr>
+        <w:rFonts w:ascii="Courier New" w:hAnsi="Courier New" w:cs="Courier New" w:hint="default"/>
+      </w:rPr>
+    </w:lvl>
+    <w:lvl w:ilvl="8" w:tplc="04090005" w:tentative="1">
+      <w:start w:val="1"/>
+      <w:numFmt w:val="bullet"/>
+      <w:lvlText w:val=""/>
+      <w:lvlJc w:val="left"/>
+      <w:pPr>
+        <w:ind w:left="6480" w:hanging="360"/>
+      </w:pPr>
+      <w:rPr>
+        <w:rFonts w:ascii="Wingdings" w:hAnsi="Wingdings" w:hint="default"/>
+      </w:rPr>
+    </w:lvl>
+  </w:abstractNum>
+  <w:abstractNum w:abstractNumId="7" w15:restartNumberingAfterBreak="0">
+    <w:nsid w:val="781468EA"/>
+    <w:multiLevelType w:val="hybridMultilevel"/>
+    <w:tmpl w:val="3C46A49E"/>
+    <w:lvl w:ilvl="0" w:tplc="04090001">
+      <w:start w:val="1"/>
+      <w:numFmt w:val="bullet"/>
+      <w:lvlText w:val=""/>
+      <w:lvlJc w:val="left"/>
+      <w:pPr>
+        <w:ind w:left="720" w:hanging="360"/>
+      </w:pPr>
+      <w:rPr>
+        <w:rFonts w:ascii="Symbol" w:hAnsi="Symbol" w:hint="default"/>
+      </w:rPr>
+    </w:lvl>
+    <w:lvl w:ilvl="1" w:tplc="04090003" w:tentative="1">
+      <w:start w:val="1"/>
+      <w:numFmt w:val="bullet"/>
+      <w:lvlText w:val="o"/>
+      <w:lvlJc w:val="left"/>
+      <w:pPr>
+        <w:ind w:left="1440" w:hanging="360"/>
+      </w:pPr>
+      <w:rPr>
+        <w:rFonts w:ascii="Courier New" w:hAnsi="Courier New" w:cs="Courier New" w:hint="default"/>
+      </w:rPr>
+    </w:lvl>
+    <w:lvl w:ilvl="2" w:tplc="04090005" w:tentative="1">
+      <w:start w:val="1"/>
+      <w:numFmt w:val="bullet"/>
+      <w:lvlText w:val=""/>
+      <w:lvlJc w:val="left"/>
+      <w:pPr>
+        <w:ind w:left="2160" w:hanging="360"/>
+      </w:pPr>
+      <w:rPr>
+        <w:rFonts w:ascii="Wingdings" w:hAnsi="Wingdings" w:hint="default"/>
+      </w:rPr>
+    </w:lvl>
+    <w:lvl w:ilvl="3" w:tplc="04090001" w:tentative="1">
+      <w:start w:val="1"/>
+      <w:numFmt w:val="bullet"/>
+      <w:lvlText w:val=""/>
+      <w:lvlJc w:val="left"/>
+      <w:pPr>
+        <w:ind w:left="2880" w:hanging="360"/>
+      </w:pPr>
+      <w:rPr>
+        <w:rFonts w:ascii="Symbol" w:hAnsi="Symbol" w:hint="default"/>
+      </w:rPr>
+    </w:lvl>
+    <w:lvl w:ilvl="4" w:tplc="04090003" w:tentative="1">
+      <w:start w:val="1"/>
+      <w:numFmt w:val="bullet"/>
+      <w:lvlText w:val="o"/>
+      <w:lvlJc w:val="left"/>
+      <w:pPr>
+        <w:ind w:left="3600" w:hanging="360"/>
+      </w:pPr>
+      <w:rPr>
+        <w:rFonts w:ascii="Courier New" w:hAnsi="Courier New" w:cs="Courier New" w:hint="default"/>
+      </w:rPr>
+    </w:lvl>
+    <w:lvl w:ilvl="5" w:tplc="04090005" w:tentative="1">
+      <w:start w:val="1"/>
+      <w:numFmt w:val="bullet"/>
+      <w:lvlText w:val=""/>
+      <w:lvlJc w:val="left"/>
+      <w:pPr>
+        <w:ind w:left="4320" w:hanging="360"/>
+      </w:pPr>
+      <w:rPr>
+        <w:rFonts w:ascii="Wingdings" w:hAnsi="Wingdings" w:hint="default"/>
+      </w:rPr>
+    </w:lvl>
+    <w:lvl w:ilvl="6" w:tplc="04090001" w:tentative="1">
+      <w:start w:val="1"/>
+      <w:numFmt w:val="bullet"/>
+      <w:lvlText w:val=""/>
+      <w:lvlJc w:val="left"/>
+      <w:pPr>
+        <w:ind w:left="5040" w:hanging="360"/>
+      </w:pPr>
+      <w:rPr>
+        <w:rFonts w:ascii="Symbol" w:hAnsi="Symbol" w:hint="default"/>
+      </w:rPr>
+    </w:lvl>
+    <w:lvl w:ilvl="7" w:tplc="04090003" w:tentative="1">
+      <w:start w:val="1"/>
+      <w:numFmt w:val="bullet"/>
+      <w:lvlText w:val="o"/>
+      <w:lvlJc w:val="left"/>
+      <w:pPr>
+        <w:ind w:left="5760" w:hanging="360"/>
+      </w:pPr>
+      <w:rPr>
+        <w:rFonts w:ascii="Courier New" w:hAnsi="Courier New" w:cs="Courier New" w:hint="default"/>
+      </w:rPr>
+    </w:lvl>
+    <w:lvl w:ilvl="8" w:tplc="04090005" w:tentative="1">
+      <w:start w:val="1"/>
+      <w:numFmt w:val="bullet"/>
+      <w:lvlText w:val=""/>
+      <w:lvlJc w:val="left"/>
+      <w:pPr>
+        <w:ind w:left="6480" w:hanging="360"/>
+      </w:pPr>
+      <w:rPr>
+        <w:rFonts w:ascii="Wingdings" w:hAnsi="Wingdings" w:hint="default"/>
+      </w:rPr>
+    </w:lvl>
+  </w:abstractNum>
   <w:num w:numId="1">
-    <w:abstractNumId w:val="1"/>
+    <w:abstractNumId w:val="3"/>
   </w:num>
   <w:num w:numId="2">
-    <w:abstractNumId w:val="3"/>
+    <w:abstractNumId w:val="5"/>
   </w:num>
   <w:num w:numId="3">
     <w:abstractNumId w:val="0"/>
   </w:num>
   <w:num w:numId="4">
+    <w:abstractNumId w:val="4"/>
+  </w:num>
+  <w:num w:numId="5">
+    <w:abstractNumId w:val="6"/>
+  </w:num>
+  <w:num w:numId="6">
+    <w:abstractNumId w:val="7"/>
+  </w:num>
+  <w:num w:numId="7">
     <w:abstractNumId w:val="2"/>
+  </w:num>
+  <w:num w:numId="8">
+    <w:abstractNumId w:val="1"/>
   </w:num>
 </w:numbering>
 </file>
@@ -2028,7 +3032,6 @@
     <w:next w:val="Normal"/>
     <w:link w:val="Heading2Char"/>
     <w:uiPriority w:val="9"/>
-    <w:semiHidden/>
     <w:unhideWhenUsed/>
     <w:qFormat/>
     <w:rsid w:val="008F0DF5"/>
@@ -2048,6 +3051,7 @@
   <w:style w:type="character" w:default="1" w:styleId="DefaultParagraphFont">
     <w:name w:val="Default Paragraph Font"/>
     <w:uiPriority w:val="1"/>
+    <w:semiHidden/>
     <w:unhideWhenUsed/>
   </w:style>
   <w:style w:type="table" w:default="1" w:styleId="TableNormal">
@@ -2157,7 +3161,6 @@
     <w:basedOn w:val="DefaultParagraphFont"/>
     <w:link w:val="Heading2"/>
     <w:uiPriority w:val="9"/>
-    <w:semiHidden/>
     <w:rsid w:val="008F0DF5"/>
     <w:rPr>
       <w:rFonts w:asciiTheme="majorHAnsi" w:eastAsiaTheme="majorEastAsia" w:hAnsiTheme="majorHAnsi" w:cstheme="majorBidi"/>

</xml_diff>